<commit_message>
Cancionero letras: agregar canción LOADO SÍ en Alabanzas
Co-Authored-By: Claude Opus 5.5 <noreply@anthropic.com>
Claude-Session: https://claude.ai/code/session_01Rmyx3T6f1q8oxq2hj7PNAF
</commit_message>
<xml_diff>
--- a/cancionero/Cancionero-Ordinario-2026-Letras.docx
+++ b/cancionero/Cancionero-Ordinario-2026-Letras.docx
@@ -13118,6 +13118,74 @@
     </w:p>
     <w:p>
       <w:pPr>
+        <w:pStyle w:val="TDC2"/>
+        <w:tabs>
+          <w:tab w:val="right" w:leader="dot" w:pos="9352"/>
+        </w:tabs>
+        <w:rPr>
+          <w:noProof/>
+        </w:rPr>
+      </w:pPr>
+      <w:hyperlink w:anchor="_Toc900187" w:history="1">
+        <w:r>
+          <w:rPr>
+            <w:rStyle w:val="Hipervnculo"/>
+            <w:noProof/>
+          </w:rPr>
+          <w:t xml:space="preserve">LOADO SÍ</w:t>
+        </w:r>
+        <w:r>
+          <w:rPr>
+            <w:noProof/>
+            <w:webHidden/>
+          </w:rPr>
+          <w:tab/>
+        </w:r>
+        <w:r>
+          <w:rPr>
+            <w:noProof/>
+            <w:webHidden/>
+          </w:rPr>
+          <w:fldChar w:fldCharType="begin"/>
+        </w:r>
+        <w:r>
+          <w:rPr>
+            <w:noProof/>
+            <w:webHidden/>
+          </w:rPr>
+          <w:instrText xml:space="preserve"> PAGEREF _Toc900187 \h </w:instrText>
+        </w:r>
+        <w:r>
+          <w:rPr>
+            <w:noProof/>
+            <w:webHidden/>
+          </w:rPr>
+        </w:r>
+        <w:r>
+          <w:rPr>
+            <w:noProof/>
+            <w:webHidden/>
+          </w:rPr>
+          <w:fldChar w:fldCharType="separate"/>
+        </w:r>
+        <w:r>
+          <w:rPr>
+            <w:noProof/>
+            <w:webHidden/>
+          </w:rPr>
+          <w:t>94</w:t>
+        </w:r>
+        <w:r>
+          <w:rPr>
+            <w:noProof/>
+            <w:webHidden/>
+          </w:rPr>
+          <w:fldChar w:fldCharType="end"/>
+        </w:r>
+      </w:hyperlink>
+    </w:p>
+    <w:p>
+      <w:pPr>
         <w:pStyle w:val="TDC1"/>
         <w:tabs>
           <w:tab w:val="right" w:leader="dot" w:pos="9352"/>
@@ -13126,7 +13194,7 @@
           <w:noProof/>
         </w:rPr>
       </w:pPr>
-      <w:hyperlink w:anchor="_Toc900187" w:history="1">
+      <w:hyperlink w:anchor="_Toc900188" w:history="1">
         <w:r>
           <w:rPr>
             <w:rStyle w:val="Hipervnculo"/>
@@ -13153,7 +13221,7 @@
             <w:noProof/>
             <w:webHidden/>
           </w:rPr>
-          <w:instrText xml:space="preserve"> PAGEREF _Toc900187 \h </w:instrText>
+          <w:instrText xml:space="preserve"> PAGEREF _Toc900188 \h </w:instrText>
         </w:r>
         <w:r>
           <w:rPr>
@@ -13194,7 +13262,7 @@
           <w:noProof/>
         </w:rPr>
       </w:pPr>
-      <w:hyperlink w:anchor="_Toc900188" w:history="1">
+      <w:hyperlink w:anchor="_Toc900189" w:history="1">
         <w:r>
           <w:rPr>
             <w:rStyle w:val="Hipervnculo"/>
@@ -13221,7 +13289,7 @@
             <w:noProof/>
             <w:webHidden/>
           </w:rPr>
-          <w:instrText xml:space="preserve"> PAGEREF _Toc900188 \h </w:instrText>
+          <w:instrText xml:space="preserve"> PAGEREF _Toc900189 \h </w:instrText>
         </w:r>
         <w:r>
           <w:rPr>
@@ -13262,7 +13330,7 @@
           <w:noProof/>
         </w:rPr>
       </w:pPr>
-      <w:hyperlink w:anchor="_Toc900189" w:history="1">
+      <w:hyperlink w:anchor="_Toc900190" w:history="1">
         <w:r>
           <w:rPr>
             <w:rStyle w:val="Hipervnculo"/>
@@ -13289,7 +13357,7 @@
             <w:noProof/>
             <w:webHidden/>
           </w:rPr>
-          <w:instrText xml:space="preserve"> PAGEREF _Toc900189 \h </w:instrText>
+          <w:instrText xml:space="preserve"> PAGEREF _Toc900190 \h </w:instrText>
         </w:r>
         <w:r>
           <w:rPr>
@@ -13330,7 +13398,7 @@
           <w:noProof/>
         </w:rPr>
       </w:pPr>
-      <w:hyperlink w:anchor="_Toc900190" w:history="1">
+      <w:hyperlink w:anchor="_Toc900191" w:history="1">
         <w:r>
           <w:rPr>
             <w:rStyle w:val="Hipervnculo"/>
@@ -13357,7 +13425,7 @@
             <w:noProof/>
             <w:webHidden/>
           </w:rPr>
-          <w:instrText xml:space="preserve"> PAGEREF _Toc900190 \h </w:instrText>
+          <w:instrText xml:space="preserve"> PAGEREF _Toc900191 \h </w:instrText>
         </w:r>
         <w:r>
           <w:rPr>
@@ -13398,7 +13466,7 @@
           <w:noProof/>
         </w:rPr>
       </w:pPr>
-      <w:hyperlink w:anchor="_Toc900191" w:history="1">
+      <w:hyperlink w:anchor="_Toc900192" w:history="1">
         <w:r>
           <w:rPr>
             <w:rStyle w:val="Hipervnculo"/>
@@ -13425,7 +13493,7 @@
             <w:noProof/>
             <w:webHidden/>
           </w:rPr>
-          <w:instrText xml:space="preserve"> PAGEREF _Toc900191 \h </w:instrText>
+          <w:instrText xml:space="preserve"> PAGEREF _Toc900192 \h </w:instrText>
         </w:r>
         <w:r>
           <w:rPr>
@@ -13466,7 +13534,7 @@
           <w:noProof/>
         </w:rPr>
       </w:pPr>
-      <w:hyperlink w:anchor="_Toc900192" w:history="1">
+      <w:hyperlink w:anchor="_Toc900193" w:history="1">
         <w:r>
           <w:rPr>
             <w:rStyle w:val="Hipervnculo"/>
@@ -13493,7 +13561,7 @@
             <w:noProof/>
             <w:webHidden/>
           </w:rPr>
-          <w:instrText xml:space="preserve"> PAGEREF _Toc900192 \h </w:instrText>
+          <w:instrText xml:space="preserve"> PAGEREF _Toc900193 \h </w:instrText>
         </w:r>
         <w:r>
           <w:rPr>
@@ -13534,7 +13602,7 @@
           <w:noProof/>
         </w:rPr>
       </w:pPr>
-      <w:hyperlink w:anchor="_Toc900193" w:history="1">
+      <w:hyperlink w:anchor="_Toc900194" w:history="1">
         <w:r>
           <w:rPr>
             <w:rStyle w:val="Hipervnculo"/>
@@ -13561,7 +13629,7 @@
             <w:noProof/>
             <w:webHidden/>
           </w:rPr>
-          <w:instrText xml:space="preserve"> PAGEREF _Toc900193 \h </w:instrText>
+          <w:instrText xml:space="preserve"> PAGEREF _Toc900194 \h </w:instrText>
         </w:r>
         <w:r>
           <w:rPr>
@@ -13602,7 +13670,7 @@
           <w:noProof/>
         </w:rPr>
       </w:pPr>
-      <w:hyperlink w:anchor="_Toc900194" w:history="1">
+      <w:hyperlink w:anchor="_Toc900195" w:history="1">
         <w:r>
           <w:rPr>
             <w:rStyle w:val="Hipervnculo"/>
@@ -13629,7 +13697,7 @@
             <w:noProof/>
             <w:webHidden/>
           </w:rPr>
-          <w:instrText xml:space="preserve"> PAGEREF _Toc900194 \h </w:instrText>
+          <w:instrText xml:space="preserve"> PAGEREF _Toc900195 \h </w:instrText>
         </w:r>
         <w:r>
           <w:rPr>
@@ -42628,25 +42696,158 @@
     </w:p>
     <w:p>
       <w:pPr>
+        <w:pStyle w:val="Ttulo2"/>
+        <w:spacing w:before="360" w:after="120" w:line="240" w:lineRule="auto"/>
+      </w:pPr>
+      <w:bookmarkStart w:id="188" w:name="_Toc900187"/>
+      <w:r>
+        <w:t xml:space="preserve">LOADO SÍ</w:t>
+      </w:r>
+      <w:bookmarkEnd w:id="188"/>
+    </w:p>
+    <w:p>
+      <w:pPr>
+        <w:keepNext/>
+        <w:spacing w:after="0"/>
+      </w:pPr>
+      <w:r>
+        <w:t xml:space="preserve">LOADO SÍ, OH MI SEÑOR (4)</w:t>
+      </w:r>
+    </w:p>
+    <w:p>
+      <w:pPr>
+        <w:keepNext/>
+        <w:spacing w:after="0"/>
+      </w:pPr>
+    </w:p>
+    <w:p>
+      <w:pPr>
+        <w:keepNext/>
+        <w:spacing w:after="0"/>
+      </w:pPr>
+      <w:r>
+        <w:t xml:space="preserve">Y por todas tus criaturas</w:t>
+      </w:r>
+    </w:p>
+    <w:p>
+      <w:pPr>
+        <w:spacing w:after="0"/>
+      </w:pPr>
+      <w:r>
+        <w:t xml:space="preserve">por el sol y por la luna</w:t>
+      </w:r>
+    </w:p>
+    <w:p>
+      <w:pPr>
+        <w:spacing w:after="0"/>
+      </w:pPr>
+      <w:r>
+        <w:t xml:space="preserve">por el viento y las estrellas</w:t>
+      </w:r>
+    </w:p>
+    <w:p>
+      <w:pPr>
+        <w:spacing w:after="0"/>
+      </w:pPr>
+      <w:r>
+        <w:t xml:space="preserve">por el agua y el fuego</w:t>
+      </w:r>
+    </w:p>
+    <w:p>
+      <w:pPr>
+        <w:spacing w:after="0"/>
+      </w:pPr>
+    </w:p>
+    <w:p>
+      <w:pPr>
+        <w:spacing w:after="0"/>
+      </w:pPr>
+      <w:r>
+        <w:t xml:space="preserve">Por la hermana madre tierra</w:t>
+      </w:r>
+    </w:p>
+    <w:p>
+      <w:pPr>
+        <w:spacing w:after="0"/>
+      </w:pPr>
+      <w:r>
+        <w:t xml:space="preserve">que alimenta y que sostiene</w:t>
+      </w:r>
+    </w:p>
+    <w:p>
+      <w:pPr>
+        <w:spacing w:after="0"/>
+      </w:pPr>
+      <w:r>
+        <w:t xml:space="preserve">por la hierba, flor y frutos</w:t>
+      </w:r>
+    </w:p>
+    <w:p>
+      <w:pPr>
+        <w:spacing w:after="0"/>
+      </w:pPr>
+      <w:r>
+        <w:t xml:space="preserve">por los ríos y los mares</w:t>
+      </w:r>
+    </w:p>
+    <w:p>
+      <w:pPr>
+        <w:spacing w:after="0"/>
+      </w:pPr>
+    </w:p>
+    <w:p>
+      <w:pPr>
+        <w:spacing w:after="0"/>
+      </w:pPr>
+      <w:r>
+        <w:t xml:space="preserve">Que el sentido de la vida</w:t>
+      </w:r>
+    </w:p>
+    <w:p>
+      <w:pPr>
+        <w:spacing w:after="0"/>
+      </w:pPr>
+      <w:r>
+        <w:t xml:space="preserve">sea alabarte y adorarte</w:t>
+      </w:r>
+    </w:p>
+    <w:p>
+      <w:pPr>
+        <w:spacing w:after="0"/>
+      </w:pPr>
+      <w:r>
+        <w:t xml:space="preserve">Y que esta nuestra vida</w:t>
+      </w:r>
+    </w:p>
+    <w:p>
+      <w:pPr>
+        <w:spacing w:after="0"/>
+      </w:pPr>
+      <w:r>
+        <w:t xml:space="preserve">sea siempre una canción.</w:t>
+      </w:r>
+    </w:p>
+    <w:p>
+      <w:pPr>
         <w:pStyle w:val="Ttulo1"/>
         <w:pageBreakBefore/>
       </w:pPr>
-      <w:bookmarkStart w:id="188" w:name="_Toc900187"/>
+      <w:bookmarkStart w:id="189" w:name="_Toc900188"/>
       <w:r>
         <w:t xml:space="preserve">RITO BAUTISMO</w:t>
       </w:r>
-      <w:bookmarkEnd w:id="188"/>
+      <w:bookmarkEnd w:id="189"/>
     </w:p>
     <w:p>
       <w:pPr>
         <w:pStyle w:val="Ttulo2"/>
         <w:spacing w:before="360" w:after="120" w:line="240" w:lineRule="auto"/>
       </w:pPr>
-      <w:bookmarkStart w:id="189" w:name="_Toc900188"/>
+      <w:bookmarkStart w:id="190" w:name="_Toc900189"/>
       <w:r>
         <w:t xml:space="preserve">ASI COMO LA CIERVA</w:t>
       </w:r>
-      <w:bookmarkEnd w:id="189"/>
+      <w:bookmarkEnd w:id="190"/>
     </w:p>
     <w:p>
       <w:pPr>
@@ -42709,11 +42910,11 @@
         <w:pStyle w:val="Ttulo2"/>
         <w:spacing w:before="360" w:after="120" w:line="240" w:lineRule="auto"/>
       </w:pPr>
-      <w:bookmarkStart w:id="190" w:name="_Toc900189"/>
+      <w:bookmarkStart w:id="191" w:name="_Toc900190"/>
       <w:r>
         <w:t xml:space="preserve">VEN SEÑOR JESÚS</w:t>
       </w:r>
-      <w:bookmarkEnd w:id="190"/>
+      <w:bookmarkEnd w:id="191"/>
     </w:p>
     <w:p>
       <w:pPr>
@@ -42800,11 +43001,11 @@
         <w:pStyle w:val="Ttulo2"/>
         <w:spacing w:before="360" w:after="120" w:line="240" w:lineRule="auto"/>
       </w:pPr>
-      <w:bookmarkStart w:id="191" w:name="_Toc900190"/>
+      <w:bookmarkStart w:id="192" w:name="_Toc900191"/>
       <w:r>
         <w:t xml:space="preserve">MUÉVETE EN MÍ</w:t>
       </w:r>
-      <w:bookmarkEnd w:id="191"/>
+      <w:bookmarkEnd w:id="192"/>
     </w:p>
     <w:p>
       <w:pPr>
@@ -42883,11 +43084,11 @@
         <w:pStyle w:val="Ttulo2"/>
         <w:spacing w:before="360" w:after="120" w:line="240" w:lineRule="auto"/>
       </w:pPr>
-      <w:bookmarkStart w:id="192" w:name="_Toc900191"/>
+      <w:bookmarkStart w:id="193" w:name="_Toc900192"/>
       <w:r>
         <w:t xml:space="preserve">HAY UNA UNCIÓN</w:t>
       </w:r>
-      <w:bookmarkEnd w:id="192"/>
+      <w:bookmarkEnd w:id="193"/>
     </w:p>
     <w:p>
       <w:pPr>
@@ -42937,11 +43138,11 @@
         <w:pStyle w:val="Ttulo2"/>
         <w:spacing w:before="360" w:after="120" w:line="240" w:lineRule="auto"/>
       </w:pPr>
-      <w:bookmarkStart w:id="193" w:name="_Toc900192"/>
+      <w:bookmarkStart w:id="194" w:name="_Toc900193"/>
       <w:r>
         <w:t xml:space="preserve">MORA EN MI</w:t>
       </w:r>
-      <w:bookmarkEnd w:id="193"/>
+      <w:bookmarkEnd w:id="194"/>
     </w:p>
     <w:p>
       <w:pPr>
@@ -43051,11 +43252,11 @@
         <w:pStyle w:val="Ttulo2"/>
         <w:spacing w:before="360" w:after="120" w:line="240" w:lineRule="auto"/>
       </w:pPr>
-      <w:bookmarkStart w:id="194" w:name="_Toc900193"/>
+      <w:bookmarkStart w:id="195" w:name="_Toc900194"/>
       <w:r>
         <w:t xml:space="preserve">BAUTIZAME SEÑOR CON TU ESPÍRITU</w:t>
       </w:r>
-      <w:bookmarkEnd w:id="194"/>
+      <w:bookmarkEnd w:id="195"/>
     </w:p>
     <w:p>
       <w:pPr>
@@ -43155,11 +43356,11 @@
         <w:pStyle w:val="Ttulo2"/>
         <w:spacing w:before="360" w:after="120" w:line="240" w:lineRule="auto"/>
       </w:pPr>
-      <w:bookmarkStart w:id="195" w:name="_Toc900194"/>
+      <w:bookmarkStart w:id="196" w:name="_Toc900195"/>
       <w:r>
         <w:t xml:space="preserve">ESTA ES LA LUZ DE CRISTO</w:t>
       </w:r>
-      <w:bookmarkEnd w:id="195"/>
+      <w:bookmarkEnd w:id="196"/>
     </w:p>
     <w:p>
       <w:pPr>

</xml_diff>